<commit_message>
Add chatbot job recommendations
</commit_message>
<xml_diff>
--- a/Jobify_AI_Backend_Project_Documentation.docx
+++ b/Jobify_AI_Backend_Project_Documentation.docx
@@ -14003,6 +14003,29 @@
           <w:sz w:val="21"/>
         </w:rPr>
         <w:t>The first Docker run downloads jobs.db and jobs.index from Hugging Face into the Docker volume.</w:t>
+      </w:r>
+    </w:p>
+    <w:p>
+      <w:pPr>
+        <w:pStyle w:val="Heading2"/>
+      </w:pPr>
+      <w:r>
+        <w:t>Chatbot Recommendations Integration</w:t>
+      </w:r>
+    </w:p>
+    <w:p>
+      <w:r>
+        <w:t>The applicant chatbot endpoint POST /chat is now recommendation-aware. When the applicant sends a message asking for job recommendations, such as 'recommend jobs for me' or '????? ????? ??????', and includes user_id, the backend reuses the same hybrid search logic used by POST /recommend-matches.</w:t>
+      </w:r>
+    </w:p>
+    <w:p>
+      <w:r>
+        <w:t>Frontend behavior: the Recommended for You section should call POST /recommend-matches directly. The chatbot should call POST /chat normally, and if the response contains recommended_jobs, those jobs should be rendered inside the chat message as clickable job cards.</w:t>
+      </w:r>
+    </w:p>
+    <w:p>
+      <w:r>
+        <w:t>Response addition: { reply: string, recommended_jobs?: JobSummary[] }. The recommended_jobs field appears only when the chatbot message asks for job recommendations.</w:t>
       </w:r>
     </w:p>
     <w:sectPr>

</xml_diff>

<commit_message>
Store applicant resume embeddings
</commit_message>
<xml_diff>
--- a/Jobify_AI_Backend_Project_Documentation.docx
+++ b/Jobify_AI_Backend_Project_Documentation.docx
@@ -14026,6 +14026,34 @@
     <w:p>
       <w:r>
         <w:t>Response addition: { reply: string, recommended_jobs?: JobSummary[] }. The recommended_jobs field appears only when the chatbot message asks for job recommendations.</w:t>
+      </w:r>
+    </w:p>
+    <w:p>
+      <w:pPr>
+        <w:pStyle w:val="Heading2"/>
+      </w:pPr>
+      <w:r>
+        <w:t>Stored CV Embeddings in SQL Server</w:t>
+      </w:r>
+    </w:p>
+    <w:p>
+      <w:r>
+        <w:t>The AI backend now stores applicant CV embeddings in the connected SQL Server database in dbo.ResumeEmbeddings. When the main backend uploads or replaces a CV, it should call POST /admin/sync-resume-embedding with the applicant UserId.</w:t>
+      </w:r>
+    </w:p>
+    <w:p>
+      <w:r>
+        <w:t>The table stores UserId, ApplicantID, ResumeID, ResumePath, ModelName, Dimension, TextHash, Embedding, CreatedAt, and UpdatedAt. The Embedding column is VARBINARY(MAX) and contains the normalized float32 vector generated by the configured SentenceTransformer model.</w:t>
+      </w:r>
+    </w:p>
+    <w:p>
+      <w:r>
+        <w:t>Recommended for You and recommendation-aware applicant chatbot messages now use the stored CV embedding first. If no stored embedding exists yet, the AI backend automatically creates it as a fallback.</w:t>
+      </w:r>
+    </w:p>
+    <w:p>
+      <w:r>
+        <w:t>Real endpoint testing confirmed POST /admin/sync-resume-embedding, POST /recommend-matches, POST /chat, POST /analyze-job-id, company chat endpoints, candidate ranking, and job embedding sync return HTTP 200 against the connected database. Gemini quota failures are handled with fallback responses where useful, so vector and ranking outputs can still be returned.</w:t>
       </w:r>
     </w:p>
     <w:sectPr>

</xml_diff>